<commit_message>
Update lab2: course title page, Figure X.Y captions, original screenshots
Co-Authored-By: Claude Opus 5.5 <noreply@anthropic.com>
Claude-Session: https://claude.ai/code/session_01MCWmHv1jmUGe6ZuEqYGPwj
</commit_message>
<xml_diff>
--- a/lab2/Lab2_BuligaVladislav_FAF-243.docx
+++ b/lab2/Lab2_BuligaVladislav_FAF-243.docx
@@ -274,7 +274,7 @@
           <w:szCs w:val="32"/>
           <w:lang w:val="en-GB" w:bidi="th-TH"/>
         </w:rPr>
-        <w:t>Buliga Vladislav FAF-243</w:t>
+        <w:t/>
       </w:r>
     </w:p>
     <w:p>
@@ -370,7 +370,7 @@
           <w:szCs w:val="40"/>
           <w:lang w:val="en-GB" w:bidi="th-TH"/>
         </w:rPr>
-        <w:t>Laboratory Work No.2</w:t>
+        <w:t>on laboratory work no. 2</w:t>
       </w:r>
     </w:p>
     <w:p>
@@ -470,7 +470,6 @@
         <w:autoSpaceDE w:val="0"/>
         <w:autoSpaceDN w:val="0"/>
         <w:adjustRightInd w:val="0"/>
-        <w:jc w:val="center"/>
         <w:rPr>
           <w:sz w:val="28"/>
           <w:szCs w:val="28"/>
@@ -480,61 +479,59 @@
     </w:p>
     <w:p>
       <w:pPr>
+        <w:pStyle w:val="Default"/>
+        <w:rPr>
+          <w:lang w:val="en-GB"/>
+        </w:rPr>
+      </w:pPr>
+    </w:p>
+    <w:p>
+      <w:pPr>
         <w:autoSpaceDE w:val="0"/>
         <w:autoSpaceDN w:val="0"/>
         <w:adjustRightInd w:val="0"/>
-        <w:jc w:val="center"/>
+        <w:jc w:val="right"/>
         <w:rPr>
           <w:sz w:val="28"/>
           <w:szCs w:val="28"/>
           <w:lang w:val="en-GB" w:bidi="th-TH"/>
         </w:rPr>
       </w:pPr>
+      <w:r>
+        <w:rPr>
+          <w:sz w:val="30"/>
+          <w:szCs w:val="30"/>
+          <w:lang w:val="en-GB"/>
+        </w:rPr>
+        <w:t>Done by:</w:t>
+      </w:r>
     </w:p>
     <w:p>
       <w:pPr>
         <w:autoSpaceDE w:val="0"/>
         <w:autoSpaceDN w:val="0"/>
         <w:adjustRightInd w:val="0"/>
-        <w:jc w:val="center"/>
+        <w:jc w:val="right"/>
         <w:rPr>
           <w:sz w:val="28"/>
           <w:szCs w:val="28"/>
           <w:lang w:val="en-GB" w:bidi="th-TH"/>
         </w:rPr>
       </w:pPr>
-    </w:p>
-    <w:p>
-      <w:pPr>
-        <w:autoSpaceDE w:val="0"/>
-        <w:autoSpaceDN w:val="0"/>
-        <w:adjustRightInd w:val="0"/>
-        <w:jc w:val="center"/>
-        <w:rPr>
+      <w:r>
+        <w:rPr>
+          <w:b/>
+          <w:bCs/>
           <w:sz w:val="28"/>
           <w:szCs w:val="28"/>
-          <w:lang w:val="en-GB" w:bidi="th-TH"/>
-        </w:rPr>
-      </w:pPr>
-    </w:p>
-    <w:p>
-      <w:pPr>
-        <w:autoSpaceDE w:val="0"/>
-        <w:autoSpaceDN w:val="0"/>
-        <w:adjustRightInd w:val="0"/>
-        <w:rPr>
-          <w:sz w:val="28"/>
-          <w:szCs w:val="28"/>
-          <w:lang w:val="en-GB" w:bidi="th-TH"/>
-        </w:rPr>
-      </w:pPr>
-    </w:p>
-    <w:p>
-      <w:pPr>
-        <w:pStyle w:val="Default"/>
-        <w:rPr>
           <w:lang w:val="en-GB"/>
         </w:rPr>
+        <w:t>st. gr. FAF-243, Buliga Vladislav</w:t>
+      </w:r>
+    </w:p>
+    <w:p>
+      <w:pPr>
+        <w:jc w:val="right"/>
       </w:pPr>
     </w:p>
     <w:p>
@@ -1240,7 +1237,7 @@
         <w:drawing>
           <wp:inline distT="0" distB="0" distL="0" distR="0">
             <wp:extent cx="2700000" cy="1320652"/>
-            <wp:docPr id="101" name="Figure 1"/>
+            <wp:docPr id="101" name="Figure 1.1"/>
             <a:graphic xmlns:a="http://schemas.openxmlformats.org/drawingml/2006/main">
               <a:graphicData uri="http://schemas.openxmlformats.org/drawingml/2006/picture">
                 <pic:pic xmlns:pic="http://schemas.openxmlformats.org/drawingml/2006/picture">
@@ -1272,7 +1269,7 @@
     </w:p>
     <w:p>
       <w:pPr>
-        <w:spacing w:before="0" w:after="200" w:line="360" w:lineRule="auto"/>
+        <w:spacing w:before="60" w:after="200" w:line="360" w:lineRule="auto"/>
         <w:jc w:val="center"/>
       </w:pPr>
       <w:r>
@@ -1282,7 +1279,7 @@
           <w:sz w:val="22"/>
           <w:szCs w:val="22"/>
         </w:rPr>
-        <w:t xml:space="preserve">Figure 1. xv6 booting in QEMU</w:t>
+        <w:t xml:space="preserve">Figure 1.1 – xv6 booting in QEMU</w:t>
       </w:r>
     </w:p>
     <w:p>
@@ -1435,7 +1432,7 @@
         <w:drawing>
           <wp:inline distT="0" distB="0" distL="0" distR="0">
             <wp:extent cx="2700000" cy="4844117"/>
-            <wp:docPr id="102" name="Figure 2"/>
+            <wp:docPr id="102" name="Figure 2.1"/>
             <a:graphic xmlns:a="http://schemas.openxmlformats.org/drawingml/2006/main">
               <a:graphicData uri="http://schemas.openxmlformats.org/drawingml/2006/picture">
                 <pic:pic xmlns:pic="http://schemas.openxmlformats.org/drawingml/2006/picture">
@@ -1467,7 +1464,7 @@
     </w:p>
     <w:p>
       <w:pPr>
-        <w:spacing w:before="0" w:after="200" w:line="360" w:lineRule="auto"/>
+        <w:spacing w:before="60" w:after="200" w:line="360" w:lineRule="auto"/>
         <w:jc w:val="center"/>
       </w:pPr>
       <w:r>
@@ -1477,7 +1474,7 @@
           <w:sz w:val="22"/>
           <w:szCs w:val="22"/>
         </w:rPr>
-        <w:t xml:space="preserve">Figure 2. Contents of the xv6 root directory (ls)</w:t>
+        <w:t xml:space="preserve">Figure 2.1 – Contents of the xv6 root directory (ls)</w:t>
       </w:r>
     </w:p>
     <w:p>
@@ -1490,7 +1487,7 @@
         <w:drawing>
           <wp:inline distT="0" distB="0" distL="0" distR="0">
             <wp:extent cx="5032258" cy="7200000"/>
-            <wp:docPr id="103" name="Figure 3"/>
+            <wp:docPr id="103" name="Figure 2.2"/>
             <a:graphic xmlns:a="http://schemas.openxmlformats.org/drawingml/2006/main">
               <a:graphicData uri="http://schemas.openxmlformats.org/drawingml/2006/picture">
                 <pic:pic xmlns:pic="http://schemas.openxmlformats.org/drawingml/2006/picture">
@@ -1522,7 +1519,7 @@
     </w:p>
     <w:p>
       <w:pPr>
-        <w:spacing w:before="0" w:after="200" w:line="360" w:lineRule="auto"/>
+        <w:spacing w:before="60" w:after="200" w:line="360" w:lineRule="auto"/>
         <w:jc w:val="center"/>
       </w:pPr>
       <w:r>
@@ -1532,7 +1529,7 @@
           <w:sz w:val="22"/>
           <w:szCs w:val="22"/>
         </w:rPr>
-        <w:t xml:space="preserve">Figure 3. The README file of xv6 (cat README)</w:t>
+        <w:t xml:space="preserve">Figure 2.2 – The README file of xv6 (cat README)</w:t>
       </w:r>
     </w:p>
     <w:p>
@@ -1544,8 +1541,8 @@
       <w:r>
         <w:drawing>
           <wp:inline distT="0" distB="0" distL="0" distR="0">
-            <wp:extent cx="2700000" cy="2314285"/>
-            <wp:docPr id="104" name="Figure 4"/>
+            <wp:extent cx="2700000" cy="589655"/>
+            <wp:docPr id="104" name="Figure 2.3"/>
             <a:graphic xmlns:a="http://schemas.openxmlformats.org/drawingml/2006/main">
               <a:graphicData uri="http://schemas.openxmlformats.org/drawingml/2006/picture">
                 <pic:pic xmlns:pic="http://schemas.openxmlformats.org/drawingml/2006/picture">
@@ -1562,7 +1559,7 @@
                   <pic:spPr>
                     <a:xfrm>
                       <a:off x="0" y="0"/>
-                      <a:ext cx="2700000" cy="2314285"/>
+                      <a:ext cx="2700000" cy="589655"/>
                     </a:xfrm>
                     <a:prstGeom prst="rect">
                       <a:avLst/>
@@ -1577,7 +1574,7 @@
     </w:p>
     <w:p>
       <w:pPr>
-        <w:spacing w:before="0" w:after="200" w:line="360" w:lineRule="auto"/>
+        <w:spacing w:before="60" w:after="200" w:line="360" w:lineRule="auto"/>
         <w:jc w:val="center"/>
       </w:pPr>
       <w:r>
@@ -1587,177 +1584,8 @@
           <w:sz w:val="22"/>
           <w:szCs w:val="22"/>
         </w:rPr>
-        <w:t xml:space="preserve">Figure 4. echo, a pipe (ls | grep c) and wc inside xv6</w:t>
-      </w:r>
-    </w:p>
-    <w:p>
-      <w:pPr>
-        <w:keepNext/>
-        <w:spacing w:line="360" w:lineRule="auto"/>
-        <w:jc w:val="both"/>
-      </w:pPr>
-      <w:r>
-        <w:t xml:space="preserve">Answers to the questions:</w:t>
-      </w:r>
-    </w:p>
-    <w:p>
-      <w:pPr>
-        <w:spacing w:line="360" w:lineRule="auto"/>
-        <w:ind w:left="709" w:hanging="360"/>
-        <w:jc w:val="both"/>
-      </w:pPr>
-      <w:r>
-        <w:t xml:space="preserve">- three programs xv6 ships with: ls, cat and echo (also grep, wc, sh, kill, mkdir, rm, usertests and others). In the ls output they have type 2 (regular file), while console has type 3 (device);</w:t>
-      </w:r>
-    </w:p>
-    <w:p>
-      <w:pPr>
-        <w:spacing w:line="360" w:lineRule="auto"/>
-        <w:ind w:left="709" w:hanging="360"/>
-        <w:jc w:val="both"/>
-      </w:pPr>
-      <w:r>
-        <w:t xml:space="preserve">- for a pipe to work, the OS must provide process creation (fork and exec), because the shell runs ls and grep as two separate processes at the same time, and inter-process communication: the pipe() system call creates a kernel buffer with a read end and a write end, ls writes into it and grep reads from it, and the shell connects them to standard output and standard input with close and dup;</w:t>
-      </w:r>
-    </w:p>
-    <w:p>
-      <w:pPr>
-        <w:spacing w:line="360" w:lineRule="auto"/>
-        <w:ind w:left="709" w:hanging="360"/>
-        <w:jc w:val="both"/>
-      </w:pPr>
-      <w:r>
-        <w:t xml:space="preserve">- the xv6 shell works like the Linux shell from Lab 1 (prompt, commands, pipes, redirection with &lt; and &gt;, background jobs with &amp;), but it is much more minimal: it has no command history, tab completion, environment variables, job control or scripting.</w:t>
-      </w:r>
-    </w:p>
-    <w:p>
-      <w:pPr>
-        <w:spacing w:line="360" w:lineRule="auto"/>
-        <w:ind w:firstLine="709"/>
-        <w:jc w:val="both"/>
-      </w:pPr>
-      <w:r>
-        <w:t xml:space="preserve">wc README printed 48 lines, 336 words and 2441 bytes; the size 2441 is the same as the one shown for README by ls.</w:t>
-      </w:r>
-    </w:p>
-    <w:p>
-      <w:pPr>
-        <w:keepNext/>
-        <w:spacing w:before="200" w:after="80" w:line="360" w:lineRule="auto"/>
-        <w:rPr>
-          <w:b/>
-          <w:bCs/>
-        </w:rPr>
-      </w:pPr>
-      <w:r>
-        <w:rPr>
-          <w:b/>
-          <w:bCs/>
-        </w:rPr>
-        <w:t xml:space="preserve">3.3 Task 3 — Reading the Source Code</w:t>
-      </w:r>
-    </w:p>
-    <w:p>
-      <w:pPr>
-        <w:spacing w:line="360" w:lineRule="auto"/>
-        <w:ind w:firstLine="709"/>
-        <w:jc w:val="both"/>
-      </w:pPr>
-      <w:r>
-        <w:t xml:space="preserve">After quitting QEMU the source tree was examined. The user programs user/ls.c and user/cat.c were read, then the list of system calls available to programs (user/user.h) and the kernel functions that implement read and write were found.</w:t>
-      </w:r>
-    </w:p>
-    <w:p>
-      <w:pPr>
-        <w:spacing w:after="0" w:line="240" w:lineRule="auto"/>
-      </w:pPr>
-    </w:p>
-    <w:p>
-      <w:pPr>
-        <w:keepNext/>
-        <w:keepLines/>
-        <w:spacing w:after="0" w:line="240" w:lineRule="auto"/>
-        <w:ind w:left="709"/>
-        <w:rPr>
-          <w:rFonts w:ascii="Courier New" w:hAnsi="Courier New" w:cs="Courier New"/>
-          <w:sz w:val="20"/>
-          <w:szCs w:val="20"/>
-        </w:rPr>
-      </w:pPr>
-      <w:r>
-        <w:rPr>
-          <w:rFonts w:ascii="Courier New" w:hAnsi="Courier New" w:cs="Courier New"/>
-          <w:sz w:val="20"/>
-          <w:szCs w:val="20"/>
-        </w:rPr>
-        <w:t xml:space="preserve">sed -n "1,40p" user/ls.c</w:t>
-      </w:r>
-    </w:p>
-    <w:p>
-      <w:pPr>
-        <w:keepNext/>
-        <w:keepLines/>
-        <w:spacing w:after="0" w:line="240" w:lineRule="auto"/>
-        <w:ind w:left="709"/>
-        <w:rPr>
-          <w:rFonts w:ascii="Courier New" w:hAnsi="Courier New" w:cs="Courier New"/>
-          <w:sz w:val="20"/>
-          <w:szCs w:val="20"/>
-        </w:rPr>
-      </w:pPr>
-      <w:r>
-        <w:rPr>
-          <w:rFonts w:ascii="Courier New" w:hAnsi="Courier New" w:cs="Courier New"/>
-          <w:sz w:val="20"/>
-          <w:szCs w:val="20"/>
-        </w:rPr>
-        <w:t xml:space="preserve">sed -n "1,30p" user/cat.c</w:t>
-      </w:r>
-    </w:p>
-    <w:p>
-      <w:pPr>
-        <w:keepNext/>
-        <w:keepLines/>
-        <w:spacing w:after="0" w:line="240" w:lineRule="auto"/>
-        <w:ind w:left="709"/>
-        <w:rPr>
-          <w:rFonts w:ascii="Courier New" w:hAnsi="Courier New" w:cs="Courier New"/>
-          <w:sz w:val="20"/>
-          <w:szCs w:val="20"/>
-        </w:rPr>
-      </w:pPr>
-      <w:r>
-        <w:rPr>
-          <w:rFonts w:ascii="Courier New" w:hAnsi="Courier New" w:cs="Courier New"/>
-          <w:sz w:val="20"/>
-          <w:szCs w:val="20"/>
-        </w:rPr>
-        <w:t xml:space="preserve">cat user/user.h</w:t>
-      </w:r>
-    </w:p>
-    <w:p>
-      <w:pPr>
-        <w:spacing w:after="0" w:line="240" w:lineRule="auto"/>
-        <w:ind w:left="709"/>
-        <w:rPr>
-          <w:rFonts w:ascii="Courier New" w:hAnsi="Courier New" w:cs="Courier New"/>
-          <w:sz w:val="20"/>
-          <w:szCs w:val="20"/>
-        </w:rPr>
-      </w:pPr>
-      <w:r>
-        <w:rPr>
-          <w:rFonts w:ascii="Courier New" w:hAnsi="Courier New" w:cs="Courier New"/>
-          <w:sz w:val="20"/>
-          <w:szCs w:val="20"/>
-        </w:rPr>
-        <w:t xml:space="preserve">grep -n "sys_read\|sys_write" kernel/sysfile.c | head</w:t>
-      </w:r>
-    </w:p>
-    <w:p>
-      <w:pPr>
-        <w:spacing w:after="0" w:line="240" w:lineRule="auto"/>
-      </w:pPr>
+        <w:t xml:space="preserve">Figure 2.3 – echo hello xv6</w:t>
+      </w:r>
     </w:p>
     <w:p>
       <w:pPr>
@@ -1768,8 +1596,8 @@
       <w:r>
         <w:drawing>
           <wp:inline distT="0" distB="0" distL="0" distR="0">
-            <wp:extent cx="5093824" cy="7200000"/>
-            <wp:docPr id="105" name="Figure 5"/>
+            <wp:extent cx="2700000" cy="1227272"/>
+            <wp:docPr id="105" name="Figure 2.4"/>
             <a:graphic xmlns:a="http://schemas.openxmlformats.org/drawingml/2006/main">
               <a:graphicData uri="http://schemas.openxmlformats.org/drawingml/2006/picture">
                 <pic:pic xmlns:pic="http://schemas.openxmlformats.org/drawingml/2006/picture">
@@ -1779,6 +1607,285 @@
                   </pic:nvPicPr>
                   <pic:blipFill>
                     <a:blip r:embed="rIdF5"/>
+                    <a:stretch>
+                      <a:fillRect/>
+                    </a:stretch>
+                  </pic:blipFill>
+                  <pic:spPr>
+                    <a:xfrm>
+                      <a:off x="0" y="0"/>
+                      <a:ext cx="2700000" cy="1227272"/>
+                    </a:xfrm>
+                    <a:prstGeom prst="rect">
+                      <a:avLst/>
+                    </a:prstGeom>
+                  </pic:spPr>
+                </pic:pic>
+              </a:graphicData>
+            </a:graphic>
+          </wp:inline>
+        </w:drawing>
+      </w:r>
+    </w:p>
+    <w:p>
+      <w:pPr>
+        <w:spacing w:before="60" w:after="200" w:line="360" w:lineRule="auto"/>
+        <w:jc w:val="center"/>
+      </w:pPr>
+      <w:r>
+        <w:rPr>
+          <w:i/>
+          <w:iCs/>
+          <w:sz w:val="22"/>
+          <w:szCs w:val="22"/>
+        </w:rPr>
+        <w:t xml:space="preserve">Figure 2.4 – A pipe: ls | grep c</w:t>
+      </w:r>
+    </w:p>
+    <w:p>
+      <w:pPr>
+        <w:keepNext/>
+        <w:spacing w:before="120" w:after="60"/>
+        <w:jc w:val="center"/>
+      </w:pPr>
+      <w:r>
+        <w:drawing>
+          <wp:inline distT="0" distB="0" distL="0" distR="0">
+            <wp:extent cx="2700000" cy="626785"/>
+            <wp:docPr id="106" name="Figure 2.5"/>
+            <a:graphic xmlns:a="http://schemas.openxmlformats.org/drawingml/2006/main">
+              <a:graphicData uri="http://schemas.openxmlformats.org/drawingml/2006/picture">
+                <pic:pic xmlns:pic="http://schemas.openxmlformats.org/drawingml/2006/picture">
+                  <pic:nvPicPr>
+                    <pic:cNvPr id="106" name="fig6.png"/>
+                    <pic:cNvPicPr/>
+                  </pic:nvPicPr>
+                  <pic:blipFill>
+                    <a:blip r:embed="rIdF6"/>
+                    <a:stretch>
+                      <a:fillRect/>
+                    </a:stretch>
+                  </pic:blipFill>
+                  <pic:spPr>
+                    <a:xfrm>
+                      <a:off x="0" y="0"/>
+                      <a:ext cx="2700000" cy="626785"/>
+                    </a:xfrm>
+                    <a:prstGeom prst="rect">
+                      <a:avLst/>
+                    </a:prstGeom>
+                  </pic:spPr>
+                </pic:pic>
+              </a:graphicData>
+            </a:graphic>
+          </wp:inline>
+        </w:drawing>
+      </w:r>
+    </w:p>
+    <w:p>
+      <w:pPr>
+        <w:spacing w:before="60" w:after="200" w:line="360" w:lineRule="auto"/>
+        <w:jc w:val="center"/>
+      </w:pPr>
+      <w:r>
+        <w:rPr>
+          <w:i/>
+          <w:iCs/>
+          <w:sz w:val="22"/>
+          <w:szCs w:val="22"/>
+        </w:rPr>
+        <w:t xml:space="preserve">Figure 2.5 – wc README</w:t>
+      </w:r>
+    </w:p>
+    <w:p>
+      <w:pPr>
+        <w:keepNext/>
+        <w:spacing w:line="360" w:lineRule="auto"/>
+        <w:jc w:val="both"/>
+      </w:pPr>
+      <w:r>
+        <w:t xml:space="preserve">Answers to the questions:</w:t>
+      </w:r>
+    </w:p>
+    <w:p>
+      <w:pPr>
+        <w:spacing w:line="360" w:lineRule="auto"/>
+        <w:ind w:left="709" w:hanging="360"/>
+        <w:jc w:val="both"/>
+      </w:pPr>
+      <w:r>
+        <w:t xml:space="preserve">- three programs xv6 ships with: ls, cat and echo (also grep, wc, sh, kill, mkdir, rm, usertests and others). In the ls output they have type 2 (regular file), while console has type 3 (device);</w:t>
+      </w:r>
+    </w:p>
+    <w:p>
+      <w:pPr>
+        <w:spacing w:line="360" w:lineRule="auto"/>
+        <w:ind w:left="709" w:hanging="360"/>
+        <w:jc w:val="both"/>
+      </w:pPr>
+      <w:r>
+        <w:t xml:space="preserve">- for a pipe to work, the OS must provide process creation (fork and exec), because the shell runs ls and grep as two separate processes at the same time, and inter-process communication: the pipe() system call creates a kernel buffer with a read end and a write end, ls writes into it and grep reads from it, and the shell connects them to standard output and standard input with close and dup;</w:t>
+      </w:r>
+    </w:p>
+    <w:p>
+      <w:pPr>
+        <w:spacing w:line="360" w:lineRule="auto"/>
+        <w:ind w:left="709" w:hanging="360"/>
+        <w:jc w:val="both"/>
+      </w:pPr>
+      <w:r>
+        <w:t xml:space="preserve">- the xv6 shell works like the Linux shell from Lab 1 (prompt, commands, pipes, redirection with &lt; and &gt;, background jobs with &amp;), but it is much more minimal: it has no command history, tab completion, environment variables, job control or scripting.</w:t>
+      </w:r>
+    </w:p>
+    <w:p>
+      <w:pPr>
+        <w:spacing w:line="360" w:lineRule="auto"/>
+        <w:ind w:firstLine="709"/>
+        <w:jc w:val="both"/>
+      </w:pPr>
+      <w:r>
+        <w:t xml:space="preserve">wc README printed 48 lines, 336 words and 2441 bytes; the size 2441 is the same as the one shown for README by ls.</w:t>
+      </w:r>
+    </w:p>
+    <w:p>
+      <w:pPr>
+        <w:keepNext/>
+        <w:spacing w:before="200" w:after="80" w:line="360" w:lineRule="auto"/>
+        <w:rPr>
+          <w:b/>
+          <w:bCs/>
+        </w:rPr>
+      </w:pPr>
+      <w:r>
+        <w:rPr>
+          <w:b/>
+          <w:bCs/>
+        </w:rPr>
+        <w:t xml:space="preserve">3.3 Task 3 — Reading the Source Code</w:t>
+      </w:r>
+    </w:p>
+    <w:p>
+      <w:pPr>
+        <w:spacing w:line="360" w:lineRule="auto"/>
+        <w:ind w:firstLine="709"/>
+        <w:jc w:val="both"/>
+      </w:pPr>
+      <w:r>
+        <w:t xml:space="preserve">After quitting QEMU the source tree was examined. The user programs user/ls.c and user/cat.c were read, then the list of system calls available to programs (user/user.h) and the kernel functions that implement read and write were found.</w:t>
+      </w:r>
+    </w:p>
+    <w:p>
+      <w:pPr>
+        <w:spacing w:after="0" w:line="240" w:lineRule="auto"/>
+      </w:pPr>
+    </w:p>
+    <w:p>
+      <w:pPr>
+        <w:keepNext/>
+        <w:keepLines/>
+        <w:spacing w:after="0" w:line="240" w:lineRule="auto"/>
+        <w:ind w:left="709"/>
+        <w:rPr>
+          <w:rFonts w:ascii="Courier New" w:hAnsi="Courier New" w:cs="Courier New"/>
+          <w:sz w:val="20"/>
+          <w:szCs w:val="20"/>
+        </w:rPr>
+      </w:pPr>
+      <w:r>
+        <w:rPr>
+          <w:rFonts w:ascii="Courier New" w:hAnsi="Courier New" w:cs="Courier New"/>
+          <w:sz w:val="20"/>
+          <w:szCs w:val="20"/>
+        </w:rPr>
+        <w:t xml:space="preserve">sed -n "1,40p" user/ls.c</w:t>
+      </w:r>
+    </w:p>
+    <w:p>
+      <w:pPr>
+        <w:keepNext/>
+        <w:keepLines/>
+        <w:spacing w:after="0" w:line="240" w:lineRule="auto"/>
+        <w:ind w:left="709"/>
+        <w:rPr>
+          <w:rFonts w:ascii="Courier New" w:hAnsi="Courier New" w:cs="Courier New"/>
+          <w:sz w:val="20"/>
+          <w:szCs w:val="20"/>
+        </w:rPr>
+      </w:pPr>
+      <w:r>
+        <w:rPr>
+          <w:rFonts w:ascii="Courier New" w:hAnsi="Courier New" w:cs="Courier New"/>
+          <w:sz w:val="20"/>
+          <w:szCs w:val="20"/>
+        </w:rPr>
+        <w:t xml:space="preserve">sed -n "1,30p" user/cat.c</w:t>
+      </w:r>
+    </w:p>
+    <w:p>
+      <w:pPr>
+        <w:keepNext/>
+        <w:keepLines/>
+        <w:spacing w:after="0" w:line="240" w:lineRule="auto"/>
+        <w:ind w:left="709"/>
+        <w:rPr>
+          <w:rFonts w:ascii="Courier New" w:hAnsi="Courier New" w:cs="Courier New"/>
+          <w:sz w:val="20"/>
+          <w:szCs w:val="20"/>
+        </w:rPr>
+      </w:pPr>
+      <w:r>
+        <w:rPr>
+          <w:rFonts w:ascii="Courier New" w:hAnsi="Courier New" w:cs="Courier New"/>
+          <w:sz w:val="20"/>
+          <w:szCs w:val="20"/>
+        </w:rPr>
+        <w:t xml:space="preserve">cat user/user.h</w:t>
+      </w:r>
+    </w:p>
+    <w:p>
+      <w:pPr>
+        <w:spacing w:after="0" w:line="240" w:lineRule="auto"/>
+        <w:ind w:left="709"/>
+        <w:rPr>
+          <w:rFonts w:ascii="Courier New" w:hAnsi="Courier New" w:cs="Courier New"/>
+          <w:sz w:val="20"/>
+          <w:szCs w:val="20"/>
+        </w:rPr>
+      </w:pPr>
+      <w:r>
+        <w:rPr>
+          <w:rFonts w:ascii="Courier New" w:hAnsi="Courier New" w:cs="Courier New"/>
+          <w:sz w:val="20"/>
+          <w:szCs w:val="20"/>
+        </w:rPr>
+        <w:t xml:space="preserve">grep -n "sys_read\|sys_write" kernel/sysfile.c | head</w:t>
+      </w:r>
+    </w:p>
+    <w:p>
+      <w:pPr>
+        <w:spacing w:after="0" w:line="240" w:lineRule="auto"/>
+      </w:pPr>
+    </w:p>
+    <w:p>
+      <w:pPr>
+        <w:keepNext/>
+        <w:spacing w:before="120" w:after="60"/>
+        <w:jc w:val="center"/>
+      </w:pPr>
+      <w:r>
+        <w:drawing>
+          <wp:inline distT="0" distB="0" distL="0" distR="0">
+            <wp:extent cx="5093824" cy="7200000"/>
+            <wp:docPr id="107" name="Figure 3.1"/>
+            <a:graphic xmlns:a="http://schemas.openxmlformats.org/drawingml/2006/main">
+              <a:graphicData uri="http://schemas.openxmlformats.org/drawingml/2006/picture">
+                <pic:pic xmlns:pic="http://schemas.openxmlformats.org/drawingml/2006/picture">
+                  <pic:nvPicPr>
+                    <pic:cNvPr id="107" name="fig7.png"/>
+                    <pic:cNvPicPr/>
+                  </pic:nvPicPr>
+                  <pic:blipFill>
+                    <a:blip r:embed="rIdF7"/>
                     <a:stretch>
                       <a:fillRect/>
                     </a:stretch>
@@ -1801,7 +1908,7 @@
     </w:p>
     <w:p>
       <w:pPr>
-        <w:spacing w:before="0" w:after="200" w:line="360" w:lineRule="auto"/>
+        <w:spacing w:before="60" w:after="200" w:line="360" w:lineRule="auto"/>
         <w:jc w:val="center"/>
       </w:pPr>
       <w:r>
@@ -1811,7 +1918,7 @@
           <w:sz w:val="22"/>
           <w:szCs w:val="22"/>
         </w:rPr>
-        <w:t xml:space="preserve">Figure 5. System calls declared in user/user.h and location of sys_read and sys_write</w:t>
+        <w:t xml:space="preserve">Figure 3.1 – System calls declared in user/user.h and location of sys_read and sys_write</w:t>
       </w:r>
     </w:p>
     <w:p>
@@ -2409,16 +2516,16 @@
         <w:drawing>
           <wp:inline distT="0" distB="0" distL="0" distR="0">
             <wp:extent cx="2700000" cy="2418483"/>
-            <wp:docPr id="106" name="Figure 6"/>
+            <wp:docPr id="108" name="Figure 4.1"/>
             <a:graphic xmlns:a="http://schemas.openxmlformats.org/drawingml/2006/main">
               <a:graphicData uri="http://schemas.openxmlformats.org/drawingml/2006/picture">
                 <pic:pic xmlns:pic="http://schemas.openxmlformats.org/drawingml/2006/picture">
                   <pic:nvPicPr>
-                    <pic:cNvPr id="106" name="fig6.png"/>
+                    <pic:cNvPr id="108" name="fig8.png"/>
                     <pic:cNvPicPr/>
                   </pic:nvPicPr>
                   <pic:blipFill>
-                    <a:blip r:embed="rIdF6"/>
+                    <a:blip r:embed="rIdF8"/>
                     <a:stretch>
                       <a:fillRect/>
                     </a:stretch>
@@ -2441,7 +2548,7 @@
     </w:p>
     <w:p>
       <w:pPr>
-        <w:spacing w:before="0" w:after="200" w:line="360" w:lineRule="auto"/>
+        <w:spacing w:before="60" w:after="200" w:line="360" w:lineRule="auto"/>
         <w:jc w:val="center"/>
       </w:pPr>
       <w:r>
@@ -2451,7 +2558,7 @@
           <w:sz w:val="22"/>
           <w:szCs w:val="22"/>
         </w:rPr>
-        <w:t xml:space="preserve">Figure 6. Testing sleep and pingpong inside xv6</w:t>
+        <w:t xml:space="preserve">Figure 4.1 – Testing sleep and pingpong inside xv6</w:t>
       </w:r>
     </w:p>
     <w:p>
@@ -3199,7 +3306,7 @@
         <w:jc w:val="both"/>
       </w:pPr>
       <w:r>
-        <w:t xml:space="preserve">The output (Figure 7) shows "6: received ping" and "5: received pong": the child received PID 6 and the parent PID 5, which confirms that fork() created a new process and that the two processes exchanged data through the kernel.</w:t>
+        <w:t xml:space="preserve">The output (Figure 4.1) shows "6: received ping" and "5: received pong": the child received PID 6 and the parent PID 5, which confirms that fork() created a new process and that the two processes exchanged data through the kernel.</w:t>
       </w:r>
     </w:p>
     <w:p>

</xml_diff>